<commit_message>
docs: generate study script raw drafts
</commit_message>
<xml_diff>
--- a/docs/studienskripte/word-rohfassungen/woek-g-v20.docx
+++ b/docs/studienskripte/word-rohfassungen/woek-g-v20.docx
@@ -24,7 +24,7 @@
     </w:p>
     <w:p>
       <w:r>
-        <w:t>Quelle: content/studienskripte/woek-g-v20.md</w:t>
+        <w:t>Quelle: /Users/hagen/Documents/New project/content/studienskripte/woek-g-v20.md</w:t>
       </w:r>
     </w:p>
     <w:p>
@@ -81,51 +81,33 @@
       </w:r>
     </w:p>
     <w:p>
-      <w:pPr>
-        <w:pStyle w:val="ListNumber"/>
-      </w:pPr>
       <w:r>
-        <w:t>erklären, warum Wirkungspotenzial erst unter passenden gesellschaftlichen Resonanzbedingungen in tatsächliche Wirkung übergehen kann.</w:t>
+        <w:t>1. erklären, warum Wirkungspotenzial erst unter passenden gesellschaftlichen Resonanzbedingungen in tatsächliche Wirkung übergehen kann.</w:t>
       </w:r>
     </w:p>
     <w:p>
-      <w:pPr>
-        <w:pStyle w:val="ListNumber"/>
-      </w:pPr>
       <w:r>
-        <w:t>Resonanz von Zustimmung, Reichweite, Aufmerksamkeit und Popularität unterscheiden.</w:t>
+        <w:t>2. Resonanz von Zustimmung, Reichweite, Aufmerksamkeit und Popularität unterscheiden.</w:t>
       </w:r>
     </w:p>
     <w:p>
-      <w:pPr>
-        <w:pStyle w:val="ListNumber"/>
-      </w:pPr>
       <w:r>
-        <w:t>fünf zentrale Resonanzfaktoren benennen: Vertrauen, Relevanz, Verständlichkeit, Anschlussfähigkeit und Trägerstruktur.</w:t>
+        <w:t>3. fünf zentrale Resonanzfaktoren benennen: Vertrauen, Relevanz, Verständlichkeit, Anschlussfähigkeit und Trägerstruktur.</w:t>
       </w:r>
     </w:p>
     <w:p>
-      <w:pPr>
-        <w:pStyle w:val="ListNumber"/>
-      </w:pPr>
       <w:r>
-        <w:t>soziale Resonanzräume so beschreiben, dass Wirkung, Wirkungspotenzial und Wirkungsrisiko sauber getrennt bleiben.</w:t>
+        <w:t>4. soziale Resonanzräume so beschreiben, dass Wirkung, Wirkungspotenzial und Wirkungsrisiko sauber getrennt bleiben.</w:t>
       </w:r>
     </w:p>
     <w:p>
-      <w:pPr>
-        <w:pStyle w:val="ListNumber"/>
-      </w:pPr>
       <w:r>
-        <w:t>einfache Resonanzanalysen für politische, mediale, organisatorische oder technologische Wirkimpulse durchführen.</w:t>
+        <w:t>5. einfache Resonanzanalysen für politische, mediale, organisatorische oder technologische Wirkimpulse durchführen.</w:t>
       </w:r>
     </w:p>
     <w:p>
-      <w:pPr>
-        <w:pStyle w:val="ListNumber"/>
-      </w:pPr>
       <w:r>
-        <w:t>rote Linien erkennen: Resonanzarbeit darf Menschen nicht manipulieren, nicht bewerten und nicht zu Social Credit oder moralischer Sortierung werden.</w:t>
+        <w:t>6. rote Linien erkennen: Resonanzarbeit darf Menschen nicht manipulieren, nicht bewerten und nicht zu Social Credit oder moralischer Sortierung werden.</w:t>
       </w:r>
     </w:p>
     <w:p>
@@ -1421,51 +1403,33 @@
       </w:r>
     </w:p>
     <w:p>
-      <w:pPr>
-        <w:pStyle w:val="ListNumber"/>
-      </w:pPr>
       <w:r>
-        <w:t>Wirkimpuls benennen: Was ist der Auslöser?</w:t>
+        <w:t>1. Wirkimpuls benennen: Was ist der Auslöser?</w:t>
       </w:r>
     </w:p>
     <w:p>
-      <w:pPr>
-        <w:pStyle w:val="ListNumber"/>
-      </w:pPr>
       <w:r>
-        <w:t>Wirkungsempfänger benennen: Bei wem soll sich ein Zustand verändern?</w:t>
+        <w:t>2. Wirkungsempfänger benennen: Bei wem soll sich ein Zustand verändern?</w:t>
       </w:r>
     </w:p>
     <w:p>
-      <w:pPr>
-        <w:pStyle w:val="ListNumber"/>
-      </w:pPr>
       <w:r>
-        <w:t>Wirkungspotenzial trennen: Welche positive Veränderung ist möglich, aber noch nicht belegt?</w:t>
+        <w:t>3. Wirkungspotenzial trennen: Welche positive Veränderung ist möglich, aber noch nicht belegt?</w:t>
       </w:r>
     </w:p>
     <w:p>
-      <w:pPr>
-        <w:pStyle w:val="ListNumber"/>
-      </w:pPr>
       <w:r>
-        <w:t>Resonanzfaktoren prüfen: Wo sind Vertrauen, Relevanz, Verständlichkeit, Anschlussfähigkeit und Trägerstruktur stark oder schwach?</w:t>
+        <w:t>4. Resonanzfaktoren prüfen: Wo sind Vertrauen, Relevanz, Verständlichkeit, Anschlussfähigkeit und Trägerstruktur stark oder schwach?</w:t>
       </w:r>
     </w:p>
     <w:p>
-      <w:pPr>
-        <w:pStyle w:val="ListNumber"/>
-      </w:pPr>
       <w:r>
-        <w:t>Wirkungsrisiken prüfen: Welche Resonanz könnte negative Effekte verstärken?</w:t>
+        <w:t>5. Wirkungsrisiken prüfen: Welche Resonanz könnte negative Effekte verstärken?</w:t>
       </w:r>
     </w:p>
     <w:p>
-      <w:pPr>
-        <w:pStyle w:val="ListNumber"/>
-      </w:pPr>
       <w:r>
-        <w:t>Rückkopplung planen: Woran erkennen wir, ob sich ein Zustand tatsächlich verändert?</w:t>
+        <w:t>6. Rückkopplung planen: Woran erkennen wir, ob sich ein Zustand tatsächlich verändert?</w:t>
       </w:r>
     </w:p>
     <w:p>
@@ -1482,11 +1446,8 @@
       </w:r>
     </w:p>
     <w:p>
-      <w:pPr>
-        <w:pStyle w:val="ListNumber"/>
-      </w:pPr>
       <w:r>
-        <w:t>Was bedeutet gesellschaftliche Resonanz in dieser Vorlesung?</w:t>
+        <w:t>1. Was bedeutet gesellschaftliche Resonanz in dieser Vorlesung?</w:t>
       </w:r>
     </w:p>
     <w:p>
@@ -1494,7 +1455,7 @@
         <w:pStyle w:val="ListBullet"/>
       </w:pPr>
       <w:r>
-        <w:t>A) Zustimmung in sozialen Medien  B) Anschlussfähigkeit eines Wirkimpulses in einem sozialen Raum  C) Werbebudget für eine Kampagne  D) gesetzliche Pflicht zur Veröffentlichung</w:t>
+        <w:t>A) Zustimmung in sozialen Medien B) Anschlussfähigkeit eines Wirkimpulses in einem sozialen Raum C) Werbebudget für eine Kampagne D) gesetzliche Pflicht zur Veröffentlichung</w:t>
       </w:r>
     </w:p>
     <w:p>
@@ -1506,11 +1467,8 @@
       </w:r>
     </w:p>
     <w:p>
-      <w:pPr>
-        <w:pStyle w:val="ListNumber"/>
-      </w:pPr>
       <w:r>
-        <w:t>Warum ist Reichweite nicht dasselbe wie Wirkung?</w:t>
+        <w:t>2. Warum ist Reichweite nicht dasselbe wie Wirkung?</w:t>
       </w:r>
     </w:p>
     <w:p>
@@ -1518,7 +1476,7 @@
         <w:pStyle w:val="ListBullet"/>
       </w:pPr>
       <w:r>
-        <w:t>A) Weil Reichweite nie messbar ist  B) Weil Reichweite Kontakte zählt, Wirkung aber tatsächliche Zustandsveränderung meint  C) Weil Reichweite immer negativ ist  D) Weil Wirkung nur offline entsteht</w:t>
+        <w:t>A) Weil Reichweite nie messbar ist B) Weil Reichweite Kontakte zählt, Wirkung aber tatsächliche Zustandsveränderung meint C) Weil Reichweite immer negativ ist D) Weil Wirkung nur offline entsteht</w:t>
       </w:r>
     </w:p>
     <w:p>
@@ -1530,11 +1488,8 @@
       </w:r>
     </w:p>
     <w:p>
-      <w:pPr>
-        <w:pStyle w:val="ListNumber"/>
-      </w:pPr>
       <w:r>
-        <w:t>Welcher Faktor kann sachlich richtige Informationen trotzdem wirkungsarm machen?</w:t>
+        <w:t>3. Welcher Faktor kann sachlich richtige Informationen trotzdem wirkungsarm machen?</w:t>
       </w:r>
     </w:p>
     <w:p>
@@ -1542,7 +1497,7 @@
         <w:pStyle w:val="ListBullet"/>
       </w:pPr>
       <w:r>
-        <w:t>A) fehlendes Vertrauen  B) zu wenig Farbe im Layout  C) zu kurze Dateinamen  D) zu viele Tabellen</w:t>
+        <w:t>A) fehlendes Vertrauen B) zu wenig Farbe im Layout C) zu kurze Dateinamen D) zu viele Tabellen</w:t>
       </w:r>
     </w:p>
     <w:p>
@@ -1554,11 +1509,8 @@
       </w:r>
     </w:p>
     <w:p>
-      <w:pPr>
-        <w:pStyle w:val="ListNumber"/>
-      </w:pPr>
       <w:r>
-        <w:t>Was ist mit Anschlussfähigkeit gemeint?</w:t>
+        <w:t>4. Was ist mit Anschlussfähigkeit gemeint?</w:t>
       </w:r>
     </w:p>
     <w:p>
@@ -1566,7 +1518,7 @@
         <w:pStyle w:val="ListBullet"/>
       </w:pPr>
       <w:r>
-        <w:t>A) Alles so formulieren, dass niemand widerspricht  B) Neue Inhalte an vorhandene Erfahrungen, Rollen und Institutionen anschließen  C) Nur bekannte Begriffe verwenden  D) Wirkung vermeiden, damit keine Konflikte entstehen</w:t>
+        <w:t>A) Alles so formulieren, dass niemand widerspricht B) Neue Inhalte an vorhandene Erfahrungen, Rollen und Institutionen anschließen C) Nur bekannte Begriffe verwenden D) Wirkung vermeiden, damit keine Konflikte entstehen</w:t>
       </w:r>
     </w:p>
     <w:p>
@@ -1578,11 +1530,8 @@
       </w:r>
     </w:p>
     <w:p>
-      <w:pPr>
-        <w:pStyle w:val="ListNumber"/>
-      </w:pPr>
       <w:r>
-        <w:t>Warum sind Trägerstrukturen wichtig?</w:t>
+        <w:t>5. Warum sind Trägerstrukturen wichtig?</w:t>
       </w:r>
     </w:p>
     <w:p>
@@ -1590,7 +1539,7 @@
         <w:pStyle w:val="ListBullet"/>
       </w:pPr>
       <w:r>
-        <w:t>A) Sie ersetzen Wirkung  B) Sie stabilisieren Veränderungen über individuelle Einsicht hinaus  C) Sie verhindern Debatten  D) Sie machen Datenqualität überflüssig</w:t>
+        <w:t>A) Sie ersetzen Wirkung B) Sie stabilisieren Veränderungen über individuelle Einsicht hinaus C) Sie verhindern Debatten D) Sie machen Datenqualität überflüssig</w:t>
       </w:r>
     </w:p>
     <w:p>
@@ -1602,11 +1551,8 @@
       </w:r>
     </w:p>
     <w:p>
-      <w:pPr>
-        <w:pStyle w:val="ListNumber"/>
-      </w:pPr>
       <w:r>
-        <w:t>Welche rote Linie gilt für Resonanzarbeit?</w:t>
+        <w:t>6. Welche rote Linie gilt für Resonanzarbeit?</w:t>
       </w:r>
     </w:p>
     <w:p>
@@ -1614,7 +1560,7 @@
         <w:pStyle w:val="ListBullet"/>
       </w:pPr>
       <w:r>
-        <w:t>A) Verständlich erklären  B) Quellen offenlegen  C) manipulative Überwältigung statt Klärung  D) Unsicherheit benennen</w:t>
+        <w:t>A) Verständlich erklären B) Quellen offenlegen C) manipulative Überwältigung statt Klärung D) Unsicherheit benennen</w:t>
       </w:r>
     </w:p>
     <w:p>
@@ -2002,43 +1948,28 @@
       </w:r>
     </w:p>
     <w:p>
-      <w:pPr>
-        <w:pStyle w:val="ListNumber"/>
-      </w:pPr>
       <w:r>
-        <w:t>Was ist der Auslöser und welches Wirkungspotenzial wird behauptet?</w:t>
+        <w:t>1. Was ist der Auslöser und welches Wirkungspotenzial wird behauptet?</w:t>
       </w:r>
     </w:p>
     <w:p>
-      <w:pPr>
-        <w:pStyle w:val="ListNumber"/>
-      </w:pPr>
       <w:r>
-        <w:t>Welche Wirkungsempfänger wären betroffen?</w:t>
+        <w:t>2. Welche Wirkungsempfänger wären betroffen?</w:t>
       </w:r>
     </w:p>
     <w:p>
-      <w:pPr>
-        <w:pStyle w:val="ListNumber"/>
-      </w:pPr>
       <w:r>
-        <w:t>Welche Resonanzfaktoren sind stark?</w:t>
+        <w:t>3. Welche Resonanzfaktoren sind stark?</w:t>
       </w:r>
     </w:p>
     <w:p>
-      <w:pPr>
-        <w:pStyle w:val="ListNumber"/>
-      </w:pPr>
       <w:r>
-        <w:t>Welche Resonanzfaktoren sind schwach oder riskant?</w:t>
+        <w:t>4. Welche Resonanzfaktoren sind schwach oder riskant?</w:t>
       </w:r>
     </w:p>
     <w:p>
-      <w:pPr>
-        <w:pStyle w:val="ListNumber"/>
-      </w:pPr>
       <w:r>
-        <w:t>Woran würdest du echte Wirkung erkennen, nicht nur Reichweite?</w:t>
+        <w:t>5. Woran würdest du echte Wirkung erkennen, nicht nur Reichweite?</w:t>
       </w:r>
     </w:p>
     <w:p>

</xml_diff>

<commit_message>
Finalize V20 study script status
</commit_message>
<xml_diff>
--- a/docs/studienskripte/word-rohfassungen/woek-g-v20.docx
+++ b/docs/studienskripte/word-rohfassungen/woek-g-v20.docx
@@ -24,12 +24,12 @@
     </w:p>
     <w:p>
       <w:r>
-        <w:t>Quelle: /Users/hagen/Documents/New project/content/studienskripte/woek-g-v20.md</w:t>
-      </w:r>
-    </w:p>
-    <w:p>
-      <w:r>
-        <w:t>Track: Grundstudium Wirkungsökonomie Kurscode: woek-g Vorlesungscode: V20 Titel: Gesellschaftliche Resonanzfaktoren Voraussetzungen: V01–V19, insbesondere V18 „Zeit, Generationen und unsichtbare Betroffene" und V19 „Wirkstoff, Wirkmechanismus und Wirkungspotenzial" Lesezeit: ca. 90–120 Minuten Status: Tiefenskript-Sprint 7 · substanzielle Arbeitsfassung, Claude-CI/CD-Finalisierung offen Wissensbasis: aktuelles Grundlagenwerk, Website-Korpus, Journal/Blog, Akademie-Quelltexte und externe Literatur</w:t>
+        <w:t>Quelle: content/studienskripte/woek-g-v20.md</w:t>
+      </w:r>
+    </w:p>
+    <w:p>
+      <w:r>
+        <w:t>Track: Grundstudium Wirkungsökonomie Kurscode: woek-g Vorlesungscode: V20 Titel: Gesellschaftliche Resonanzfaktoren Voraussetzungen: V01–V19, insbesondere V18 „Zeit, Generationen und unsichtbare Betroffene" und V19 „Wirkstoff, Wirkmechanismus und Wirkungspotenzial" Lesezeit: ca. 90–120 Minuten Status: Studienskript V1 · fachlich finale Codex-Fassung, Claude-CI/CD-Satzfreigabe offen Wissensbasis: aktuelles Grundlagenwerk, Website-Korpus, Journal/Blog, Akademie-Quelltexte und externe Literatur</w:t>
       </w:r>
     </w:p>
     <w:p>

</xml_diff>